<commit_message>
v1.1.0: qgis plugin added etc
v1.0.0: summary PDF, HTML report fixes, QGIS plugin
</commit_message>
<xml_diff>
--- a/oystermapR_user_guide.docx
+++ b/oystermapR_user_guide.docx
@@ -42,7 +42,7 @@
           <w:color w:val="444444"/>
           <w:sz w:val="20"/>
         </w:rPr>
-        <w:t>Version 0.3.0  |  T. Tucker</w:t>
+        <w:t>Version 1.0.0  |  T. Tucker</w:t>
       </w:r>
     </w:p>
     <w:p>
@@ -3066,15 +3066,14 @@
         <w:br/>
         <w:t>combined &lt;- composite_seasonal(</w:t>
         <w:br/>
-        <w:t xml:space="preserve">  summer = result_summer,</w:t>
-        <w:br/>
-        <w:t xml:space="preserve">  winter = result_winter,</w:t>
-        <w:br/>
-        <w:t xml:space="preserve">  weight_summer = 0.6,   # summer is more limiting for O. edulis</w:t>
-        <w:br/>
-        <w:t xml:space="preserve">  weight_winter = 0.4</w:t>
+        <w:t xml:space="preserve">  surveys = list(summer = result_summer, winter = result_winter),</w:t>
+        <w:br/>
+        <w:t xml:space="preserve">  method  = "mean"   # or "min" (most conservative) / "prob"</w:t>
         <w:br/>
         <w:t>)</w:t>
+        <w:br/>
+        <w:br/>
+        <w:t># Result column: combined$suitability_composite (scores) + combined$suitability_class</w:t>
         <w:br/>
         <w:br/>
         <w:t># Compare two survey years</w:t>
@@ -3216,7 +3215,7 @@
           <w:color w:val="1A1A2E"/>
           <w:sz w:val="17"/>
         </w:rPr>
-        <w:t># Auto-generate a formatted PDF report</w:t>
+        <w:t># Auto-generate a formatted HTML report (recommended — no LaTeX needed)</w:t>
         <w:br/>
         <w:t>generate_report(</w:t>
         <w:br/>
@@ -3224,15 +3223,20 @@
         <w:br/>
         <w:t xml:space="preserve">  species = "ostrea_edulis",</w:t>
         <w:br/>
-        <w:t xml:space="preserve">  output  = "oyster_site_report.pdf",</w:t>
+        <w:t xml:space="preserve">  output  = "oyster_site_report.html",</w:t>
         <w:br/>
         <w:t xml:space="preserve">  title   = "Restoration Survey — Milford Haven 2024",</w:t>
         <w:br/>
-        <w:t xml:space="preserve">  include_maps   = TRUE,</w:t>
-        <w:br/>
-        <w:t xml:space="preserve">  include_tables = TRUE</w:t>
+        <w:t xml:space="preserve">  author  = "T. Tucker",</w:t>
+        <w:br/>
+        <w:t xml:space="preserve">  open    = TRUE</w:t>
         <w:br/>
         <w:t>)</w:t>
+        <w:br/>
+        <w:br/>
+        <w:t># PDF output also supported (requires LaTeX / tinytex):</w:t>
+        <w:br/>
+        <w:t># generate_report(result, output = "report.pdf", species = "ostrea_edulis")</w:t>
       </w:r>
     </w:p>
     <w:tbl>
@@ -5531,7 +5535,7 @@
           <w:color w:val="FFFFFF"/>
           <w:sz w:val="20"/>
         </w:rPr>
-        <w:t xml:space="preserve">  All exported functions in oystermapR v0.3.0</w:t>
+        <w:t xml:space="preserve">  All exported functions in oystermapR v1.0.0</w:t>
       </w:r>
     </w:p>
     <w:p>

</xml_diff>